<commit_message>
Fix CV address and Creo formatting
</commit_message>
<xml_diff>
--- a/assets/docs/CV_Arith_Maldonado_2026.docx
+++ b/assets/docs/CV_Arith_Maldonado_2026.docx
@@ -44,7 +44,7 @@
           <w:i w:val="0"/>
           <w:sz w:val="18"/>
         </w:rPr>
-        <w:t>C. San Simon 1214, Balcones de Santo Domingo, 66446 San Nicolas de los Garza, N.L.</w:t>
+        <w:t>C. San Simón 1214, Balcones de Santo Domingo, 66446 San Nicolás de los Garza, N.L.</w:t>
       </w:r>
     </w:p>
     <w:p>
@@ -252,7 +252,7 @@
                 <w:rFonts w:ascii="Times New Roman" w:hAnsi="Times New Roman" w:eastAsia="Times New Roman"/>
                 <w:b w:val="0"/>
                 <w:i/>
-                <w:sz w:val="18"/>
+                <w:sz w:val="19"/>
               </w:rPr>
               <w:t>B.Eng. Mechatronics Engineering (in progress)</w:t>
             </w:r>
@@ -407,7 +407,7 @@
                 <w:rFonts w:ascii="Times New Roman" w:hAnsi="Times New Roman" w:eastAsia="Times New Roman"/>
                 <w:b w:val="0"/>
                 <w:i/>
-                <w:sz w:val="18"/>
+                <w:sz w:val="19"/>
               </w:rPr>
               <w:t>B.Eng. Biomedical Engineering, Graduated with Honors Mention</w:t>
             </w:r>
@@ -579,9 +579,9 @@
                 <w:rFonts w:ascii="Times New Roman" w:hAnsi="Times New Roman" w:eastAsia="Times New Roman"/>
                 <w:b w:val="0"/>
                 <w:i/>
-                <w:sz w:val="18"/>
+                <w:sz w:val="19"/>
               </w:rPr>
-              <w:t>Punto Focal Equipo Medico</w:t>
+              <w:t>Punto Focal Equipo Médico</w:t>
             </w:r>
           </w:p>
         </w:tc>
@@ -832,7 +832,7 @@
                 <w:rFonts w:ascii="Times New Roman" w:hAnsi="Times New Roman" w:eastAsia="Times New Roman"/>
                 <w:b w:val="0"/>
                 <w:i/>
-                <w:sz w:val="18"/>
+                <w:sz w:val="19"/>
               </w:rPr>
               <w:t>ESP32, SG90 servos, Python, OpenCV, PID control, Bluetooth communication, SolidWorks (structural design)</w:t>
             </w:r>
@@ -1019,7 +1019,7 @@
                 <w:rFonts w:ascii="Times New Roman" w:hAnsi="Times New Roman" w:eastAsia="Times New Roman"/>
                 <w:b w:val="0"/>
                 <w:i/>
-                <w:sz w:val="18"/>
+                <w:sz w:val="19"/>
               </w:rPr>
               <w:t>Mobile app, backend, admin dashboard, Firebase, Vercel, CAD/SolidWorks documentation</w:t>
             </w:r>

</xml_diff>